<commit_message>
fix: Windows Public IP の DNS ラベルから予約語 "windows" を外す
apply が以下で失敗していた。

  DomainNameLabelReserved: The domain name label
  pickles-verify-windows-p0vqd is invalid. The name itself or part of
  the name is a reserved word such as a trademark.

Azure は Public IP の DNS ラベルに商標語を含められない。
リソース名（vnet-/nsg-/pip-...-windows）は問題ないが、
DNS ラベルだけは "windows" を含められないため "win" に短縮した。

  <prefix>-<env>-win-<ランダム5文字>   例: pickles-verify-win-p0vqd

併せて変数 windows_domain_name_label を追加し、
任意のラベルを指定できるようにした（既定は空＝自動生成）。
ドキュメントのリソース表とトラブルシューティングにも追記。

Co-Authored-By: Claude Opus 5 (1M context) <noreply@anthropic.com>
</commit_message>
<xml_diff>
--- a/docs/04_Ansible実行サーバ構築手順.docx
+++ b/docs/04_Ansible実行サーバ構築手順.docx
@@ -5351,7 +5351,40 @@
               <w:spacing w:after="0"/>
             </w:pPr>
             <w:r>
-              <w:t xml:space="preserve">Standard / Static / DNS ラベル付き</w:t>
+              <w:t xml:space="preserve">Standard / Static / DNS ラベルは </w:t>
+            </w:r>
+            <w:r>
+              <w:rPr>
+                <w:rFonts w:ascii="Consolas" w:hAnsi="Consolas" w:eastAsia="MS Gothic"/>
+                <w:sz w:val="18"/>
+                <w:szCs w:val="18"/>
+              </w:rPr>
+              <w:t xml:space="preserve">pickles-verify-win-&lt;ランダム&gt;</w:t>
+            </w:r>
+            <w:r>
+              <w:t xml:space="preserve">（</w:t>
+            </w:r>
+            <w:r>
+              <w:rPr>
+                <w:rFonts w:ascii="Consolas" w:hAnsi="Consolas" w:eastAsia="MS Gothic"/>
+                <w:sz w:val="18"/>
+                <w:szCs w:val="18"/>
+              </w:rPr>
+              <w:t xml:space="preserve">windows</w:t>
+            </w:r>
+            <w:r>
+              <w:t xml:space="preserve"> は Azure の予約語のため </w:t>
+            </w:r>
+            <w:r>
+              <w:rPr>
+                <w:rFonts w:ascii="Consolas" w:hAnsi="Consolas" w:eastAsia="MS Gothic"/>
+                <w:sz w:val="18"/>
+                <w:szCs w:val="18"/>
+              </w:rPr>
+              <w:t xml:space="preserve">win</w:t>
+            </w:r>
+            <w:r>
+              <w:t xml:space="preserve"> に短縮）</w:t>
             </w:r>
           </w:p>
         </w:tc>
@@ -9149,6 +9182,167 @@
             </w:r>
             <w:r>
               <w:t xml:space="preserve"> 等に変更する</w:t>
+            </w:r>
+          </w:p>
+        </w:tc>
+      </w:tr>
+      <w:tr>
+        <w:tc>
+          <w:tcPr>
+            <w:tcW w:w="3120" w:type="dxa"/>
+          </w:tcPr>
+          <w:p>
+            <w:pPr>
+              <w:spacing w:after="0"/>
+            </w:pPr>
+            <w:r>
+              <w:t xml:space="preserve">Public IP の apply が </w:t>
+            </w:r>
+            <w:r>
+              <w:rPr>
+                <w:rFonts w:ascii="Consolas" w:hAnsi="Consolas" w:eastAsia="MS Gothic"/>
+                <w:sz w:val="18"/>
+                <w:szCs w:val="18"/>
+              </w:rPr>
+              <w:t xml:space="preserve">DomainNameLabelReserved: ... is invalid. The name itself or part of the name is a reserved word such as a trademark</w:t>
+            </w:r>
+          </w:p>
+        </w:tc>
+        <w:tc>
+          <w:tcPr>
+            <w:tcW w:w="3120" w:type="dxa"/>
+          </w:tcPr>
+          <w:p>
+            <w:pPr>
+              <w:spacing w:after="0"/>
+            </w:pPr>
+            <w:r>
+              <w:t xml:space="preserve">DNS ラベルに </w:t>
+            </w:r>
+            <w:r>
+              <w:rPr>
+                <w:rFonts w:ascii="Consolas" w:hAnsi="Consolas" w:eastAsia="MS Gothic"/>
+                <w:sz w:val="18"/>
+                <w:szCs w:val="18"/>
+              </w:rPr>
+              <w:t xml:space="preserve">windows</w:t>
+            </w:r>
+            <w:r>
+              <w:t xml:space="preserve"> などの商標語が含まれている</w:t>
+            </w:r>
+          </w:p>
+        </w:tc>
+        <w:tc>
+          <w:tcPr>
+            <w:tcW w:w="3120" w:type="dxa"/>
+          </w:tcPr>
+          <w:p>
+            <w:pPr>
+              <w:spacing w:after="0"/>
+            </w:pPr>
+            <w:r>
+              <w:t xml:space="preserve">既定では </w:t>
+            </w:r>
+            <w:r>
+              <w:rPr>
+                <w:rFonts w:ascii="Consolas" w:hAnsi="Consolas" w:eastAsia="MS Gothic"/>
+                <w:sz w:val="18"/>
+                <w:szCs w:val="18"/>
+              </w:rPr>
+              <w:t xml:space="preserve">&lt;prefix&gt;-&lt;env&gt;-win-&lt;ランダム&gt;</w:t>
+            </w:r>
+            <w:r>
+              <w:t xml:space="preserve"> に短縮済み。独自ラベルを使う場合は </w:t>
+            </w:r>
+            <w:r>
+              <w:rPr>
+                <w:rFonts w:ascii="Consolas" w:hAnsi="Consolas" w:eastAsia="MS Gothic"/>
+                <w:sz w:val="18"/>
+                <w:szCs w:val="18"/>
+              </w:rPr>
+              <w:t xml:space="preserve">windows_domain_name_label</w:t>
+            </w:r>
+            <w:r>
+              <w:t xml:space="preserve"> に商標語（windows / microsoft / azure / xbox 等）を含めない値を指定する</w:t>
+            </w:r>
+          </w:p>
+        </w:tc>
+      </w:tr>
+      <w:tr>
+        <w:tc>
+          <w:tcPr>
+            <w:tcW w:w="3120" w:type="dxa"/>
+          </w:tcPr>
+          <w:p>
+            <w:pPr>
+              <w:spacing w:after="0"/>
+            </w:pPr>
+            <w:r>
+              <w:t xml:space="preserve">Public IP の apply が </w:t>
+            </w:r>
+            <w:r>
+              <w:rPr>
+                <w:rFonts w:ascii="Consolas" w:hAnsi="Consolas" w:eastAsia="MS Gothic"/>
+                <w:sz w:val="18"/>
+                <w:szCs w:val="18"/>
+              </w:rPr>
+              <w:t xml:space="preserve">DomainNameLabel ... is already taken</w:t>
+            </w:r>
+          </w:p>
+        </w:tc>
+        <w:tc>
+          <w:tcPr>
+            <w:tcW w:w="3120" w:type="dxa"/>
+          </w:tcPr>
+          <w:p>
+            <w:pPr>
+              <w:spacing w:after="0"/>
+            </w:pPr>
+            <w:r>
+              <w:t xml:space="preserve">同じリージョンで DNS ラベルが重複している</w:t>
+            </w:r>
+          </w:p>
+        </w:tc>
+        <w:tc>
+          <w:tcPr>
+            <w:tcW w:w="3120" w:type="dxa"/>
+          </w:tcPr>
+          <w:p>
+            <w:pPr>
+              <w:spacing w:after="0"/>
+            </w:pPr>
+            <w:r>
+              <w:rPr>
+                <w:rFonts w:ascii="Consolas" w:hAnsi="Consolas" w:eastAsia="MS Gothic"/>
+                <w:sz w:val="18"/>
+                <w:szCs w:val="18"/>
+              </w:rPr>
+              <w:t xml:space="preserve">prefix</w:t>
+            </w:r>
+            <w:r>
+              <w:t xml:space="preserve"> / </w:t>
+            </w:r>
+            <w:r>
+              <w:rPr>
+                <w:rFonts w:ascii="Consolas" w:hAnsi="Consolas" w:eastAsia="MS Gothic"/>
+                <w:sz w:val="18"/>
+                <w:szCs w:val="18"/>
+              </w:rPr>
+              <w:t xml:space="preserve">env</w:t>
+            </w:r>
+            <w:r>
+              <w:t xml:space="preserve"> を変えるか、</w:t>
+            </w:r>
+            <w:r>
+              <w:rPr>
+                <w:rFonts w:ascii="Consolas" w:hAnsi="Consolas" w:eastAsia="MS Gothic"/>
+                <w:sz w:val="18"/>
+                <w:szCs w:val="18"/>
+              </w:rPr>
+              <w:t xml:space="preserve">windows_domain_name_label</w:t>
+            </w:r>
+            <w:r>
+              <w:t xml:space="preserve"> を明示指定する</w:t>
             </w:r>
           </w:p>
         </w:tc>

</xml_diff>

<commit_message>
fix: Windows VM に patch_mode = AutomaticByPlatform を設定
apply が以下で失敗していた。

  "patch_mode" must always be set to "AutomaticByPlatform" when
  "source_image_reference" points to a hotpatch enabled image

既定イメージ 2025-datacenter-azure-edition はホットパッチ対応のため、
azurerm プロバイダが patch_mode の明示を要求する。

- windows_patch_mode（既定 AutomaticByPlatform）を追加
- patch_assessment_mode を patch_mode に合わせて設定
- windows_hotpatching_enabled（既定 false）を追加
  検証環境では再起動なし更新の挙動を持ち込まないため無効のままにする
- トラブルシューティングに該当行を追記

なお本設定は Azure プラットフォーム側の更新方式であり、
Ansible 側（設計書 1.14）のローカル GPO による自動更新の無効化とは別物。

Co-Authored-By: Claude Opus 5 (1M context) <noreply@anthropic.com>
</commit_message>
<xml_diff>
--- a/docs/04_Ansible実行サーバ構築手順.docx
+++ b/docs/04_Ansible実行サーバ構築手順.docx
@@ -9264,6 +9264,107 @@
             </w:r>
             <w:r>
               <w:t xml:space="preserve"> に商標語（windows / microsoft / azure / xbox 等）を含めない値を指定する</w:t>
+            </w:r>
+          </w:p>
+        </w:tc>
+      </w:tr>
+      <w:tr>
+        <w:tc>
+          <w:tcPr>
+            <w:tcW w:w="3120" w:type="dxa"/>
+          </w:tcPr>
+          <w:p>
+            <w:pPr>
+              <w:spacing w:after="0"/>
+            </w:pPr>
+            <w:r>
+              <w:t xml:space="preserve">Windows VM の apply が </w:t>
+            </w:r>
+            <w:r>
+              <w:rPr>
+                <w:rFonts w:ascii="Consolas" w:hAnsi="Consolas" w:eastAsia="MS Gothic"/>
+                <w:sz w:val="18"/>
+                <w:szCs w:val="18"/>
+              </w:rPr>
+              <w:t xml:space="preserve">"patch_mode" must always be set to "AutomaticByPlatform" when "source_image_reference" points to a hotpatch enabled image</w:t>
+            </w:r>
+          </w:p>
+        </w:tc>
+        <w:tc>
+          <w:tcPr>
+            <w:tcW w:w="3120" w:type="dxa"/>
+          </w:tcPr>
+          <w:p>
+            <w:pPr>
+              <w:spacing w:after="0"/>
+            </w:pPr>
+            <w:r>
+              <w:rPr>
+                <w:rFonts w:ascii="Consolas" w:hAnsi="Consolas" w:eastAsia="MS Gothic"/>
+                <w:sz w:val="18"/>
+                <w:szCs w:val="18"/>
+              </w:rPr>
+              <w:t xml:space="preserve">azure-edition</w:t>
+            </w:r>
+            <w:r>
+              <w:t xml:space="preserve"> 系イメージはホットパッチ対応のため </w:t>
+            </w:r>
+            <w:r>
+              <w:rPr>
+                <w:rFonts w:ascii="Consolas" w:hAnsi="Consolas" w:eastAsia="MS Gothic"/>
+                <w:sz w:val="18"/>
+                <w:szCs w:val="18"/>
+              </w:rPr>
+              <w:t xml:space="preserve">patch_mode</w:t>
+            </w:r>
+            <w:r>
+              <w:t xml:space="preserve"> の明示が必要</w:t>
+            </w:r>
+          </w:p>
+        </w:tc>
+        <w:tc>
+          <w:tcPr>
+            <w:tcW w:w="3120" w:type="dxa"/>
+          </w:tcPr>
+          <w:p>
+            <w:pPr>
+              <w:spacing w:after="0"/>
+            </w:pPr>
+            <w:r>
+              <w:t xml:space="preserve">既定で </w:t>
+            </w:r>
+            <w:r>
+              <w:rPr>
+                <w:rFonts w:ascii="Consolas" w:hAnsi="Consolas" w:eastAsia="MS Gothic"/>
+                <w:sz w:val="18"/>
+                <w:szCs w:val="18"/>
+              </w:rPr>
+              <w:t xml:space="preserve">windows_patch_mode = "AutomaticByPlatform"</w:t>
+            </w:r>
+            <w:r>
+              <w:t xml:space="preserve"> を設定済み。ホットパッチ非対応イメージに変更した場合のみ </w:t>
+            </w:r>
+            <w:r>
+              <w:rPr>
+                <w:rFonts w:ascii="Consolas" w:hAnsi="Consolas" w:eastAsia="MS Gothic"/>
+                <w:sz w:val="18"/>
+                <w:szCs w:val="18"/>
+              </w:rPr>
+              <w:t xml:space="preserve">AutomaticByOS</w:t>
+            </w:r>
+            <w:r>
+              <w:t xml:space="preserve"> / </w:t>
+            </w:r>
+            <w:r>
+              <w:rPr>
+                <w:rFonts w:ascii="Consolas" w:hAnsi="Consolas" w:eastAsia="MS Gothic"/>
+                <w:sz w:val="18"/>
+                <w:szCs w:val="18"/>
+              </w:rPr>
+              <w:t xml:space="preserve">Manual</w:t>
+            </w:r>
+            <w:r>
+              <w:t xml:space="preserve"> も指定できる</w:t>
             </w:r>
           </w:p>
         </w:tc>

</xml_diff>

<commit_message>
fix: bootstrap_winrm.ps1 を ASCII 化し、Run Command の文字化けを解消
apply が以下で失敗していた。

  VMExtensionProvisioningError ... 'winrm-bootstrap'
  Script_winrm-bootstrap_0.ps1:66 char:96
  The string is missing the terminator: '.

原因は文字コード。Azure Run Command はスクリプトを BOM 無しでファイル化し、
Windows PowerShell 5.1 はそれを UTF-8 ではなく ANSI として読む。
そのため日本語コメント / Write-Host メッセージが化け、
66 行目の文字列リテラルの終端が壊れて構文エラーになっていた。

- bootstrap_winrm.ps1 のコメント・メッセージをすべて英語（ASCII）に変更
  処理内容は変更していない
- 冒頭に「ASCII のみで記述すること」の警告と、その理由（再発防止）を明記
- windows.tf に precondition を追加し、非 ASCII が混入したら
  apply まで進まず plan の時点で検出されるようにした
- ドキュメント（04 / terraform README）にも制約とトラブルシューティングを追記

Co-Authored-By: Claude Opus 5 (1M context) <noreply@anthropic.com>
</commit_message>
<xml_diff>
--- a/docs/04_Ansible実行サーバ構築手順.docx
+++ b/docs/04_Ansible実行サーバ構築手順.docx
@@ -9365,6 +9365,146 @@
             </w:r>
             <w:r>
               <w:t xml:space="preserve"> も指定できる</w:t>
+            </w:r>
+          </w:p>
+        </w:tc>
+      </w:tr>
+      <w:tr>
+        <w:tc>
+          <w:tcPr>
+            <w:tcW w:w="3120" w:type="dxa"/>
+          </w:tcPr>
+          <w:p>
+            <w:pPr>
+              <w:spacing w:after="0"/>
+            </w:pPr>
+            <w:r>
+              <w:t xml:space="preserve">Run Command が </w:t>
+            </w:r>
+            <w:r>
+              <w:rPr>
+                <w:rFonts w:ascii="Consolas" w:hAnsi="Consolas" w:eastAsia="MS Gothic"/>
+                <w:sz w:val="18"/>
+                <w:szCs w:val="18"/>
+              </w:rPr>
+              <w:t xml:space="preserve">VMExtensionProvisioningError</w:t>
+            </w:r>
+            <w:r>
+              <w:t xml:space="preserve"> で失敗し、詳細に </w:t>
+            </w:r>
+            <w:r>
+              <w:rPr>
+                <w:rFonts w:ascii="Consolas" w:hAnsi="Consolas" w:eastAsia="MS Gothic"/>
+                <w:sz w:val="18"/>
+                <w:szCs w:val="18"/>
+              </w:rPr>
+              <w:t xml:space="preserve">The string is missing the terminator: '.</w:t>
+            </w:r>
+            <w:r>
+              <w:t xml:space="preserve"> が出る</w:t>
+            </w:r>
+          </w:p>
+        </w:tc>
+        <w:tc>
+          <w:tcPr>
+            <w:tcW w:w="3120" w:type="dxa"/>
+          </w:tcPr>
+          <w:p>
+            <w:pPr>
+              <w:spacing w:after="0"/>
+            </w:pPr>
+            <w:r>
+              <w:rPr>
+                <w:rFonts w:ascii="Consolas" w:hAnsi="Consolas" w:eastAsia="MS Gothic"/>
+                <w:sz w:val="18"/>
+                <w:szCs w:val="18"/>
+              </w:rPr>
+              <w:t xml:space="preserve">bootstrap_winrm.ps1</w:t>
+            </w:r>
+            <w:r>
+              <w:t xml:space="preserve"> に非 ASCII 文字（日本語）が含まれている。Run Command は BOM 無しでファイル化するため PowerShell 5.1 が ANSI として読み、文字化けして構文エラーになる</w:t>
+            </w:r>
+          </w:p>
+        </w:tc>
+        <w:tc>
+          <w:tcPr>
+            <w:tcW w:w="3120" w:type="dxa"/>
+          </w:tcPr>
+          <w:p>
+            <w:pPr>
+              <w:spacing w:after="0"/>
+            </w:pPr>
+            <w:r>
+              <w:t xml:space="preserve">同スクリプトは </w:t>
+            </w:r>
+            <w:r>
+              <w:rPr>
+                <w:b/>
+              </w:rPr>
+              <w:t xml:space="preserve">ASCII のみ</w:t>
+            </w:r>
+            <w:r>
+              <w:t xml:space="preserve">で記述する（日本語の説明はドキュメント側に置く）。plan 時に precondition で検出される。確認: </w:t>
+            </w:r>
+            <w:r>
+              <w:rPr>
+                <w:rFonts w:ascii="Consolas" w:hAnsi="Consolas" w:eastAsia="MS Gothic"/>
+                <w:sz w:val="18"/>
+                <w:szCs w:val="18"/>
+              </w:rPr>
+              <w:t xml:space="preserve">grep -n -P '[^\x00-\x7F]' terraform/scripts/bootstrap_winrm.ps1</w:t>
+            </w:r>
+          </w:p>
+        </w:tc>
+      </w:tr>
+      <w:tr>
+        <w:tc>
+          <w:tcPr>
+            <w:tcW w:w="3120" w:type="dxa"/>
+          </w:tcPr>
+          <w:p>
+            <w:pPr>
+              <w:spacing w:after="0"/>
+            </w:pPr>
+            <w:r>
+              <w:t xml:space="preserve">Run Command が失敗した状態で残り、再 apply でも同じエラーになる</w:t>
+            </w:r>
+          </w:p>
+        </w:tc>
+        <w:tc>
+          <w:tcPr>
+            <w:tcW w:w="3120" w:type="dxa"/>
+          </w:tcPr>
+          <w:p>
+            <w:pPr>
+              <w:spacing w:after="0"/>
+            </w:pPr>
+            <w:r>
+              <w:t xml:space="preserve">拡張機能が失敗状態のまま VM に残っている</w:t>
+            </w:r>
+          </w:p>
+        </w:tc>
+        <w:tc>
+          <w:tcPr>
+            <w:tcW w:w="3120" w:type="dxa"/>
+          </w:tcPr>
+          <w:p>
+            <w:pPr>
+              <w:spacing w:after="0"/>
+            </w:pPr>
+            <w:r>
+              <w:t xml:space="preserve">Azure Portal の VM → 「実行コマンド」で </w:t>
+            </w:r>
+            <w:r>
+              <w:rPr>
+                <w:rFonts w:ascii="Consolas" w:hAnsi="Consolas" w:eastAsia="MS Gothic"/>
+                <w:sz w:val="18"/>
+                <w:szCs w:val="18"/>
+              </w:rPr>
+              <w:t xml:space="preserve">winrm-bootstrap</w:t>
+            </w:r>
+            <w:r>
+              <w:t xml:space="preserve"> を削除してから再 apply する</w:t>
             </w:r>
           </w:p>
         </w:tc>

</xml_diff>